<commit_message>
docs: Handlungsanleitung je offenem Punkt ergaenzt (DE/EN)
- Punkt 2: DNS-Anleitung (A-Record erp -> Server-IP) statt nur Status
- Punkt 4: Klickpfad zum Anlegen von Bankkonto, Journal-Verknuepfung, Telefon
- Punkt 6: TeamViewer-ID/Kennwort und Termin als benoetigte Angaben
- Uebersicht 'Was wir von Ihnen benoetigen'
</commit_message>
<xml_diff>
--- a/docs/handover/Erzberger_Offene_Punkte_und_Umsetzungsstand_DE.docx
+++ b/docs/handover/Erzberger_Offene_Punkte_und_Umsetzungsstand_DE.docx
@@ -720,7 +720,83 @@
           <w:color w:val="222222"/>
           <w:sz w:val="22"/>
         </w:rPr>
-        <w:t>Offen</w:t>
+        <w:t>So tragen Sie die Nummer ein</w:t>
+      </w:r>
+    </w:p>
+    <w:p>
+      <w:pPr>
+        <w:spacing w:after="40" w:line="264" w:lineRule="auto"/>
+        <w:ind w:left="397" w:hanging="397"/>
+      </w:pPr>
+      <w:r>
+        <w:rPr>
+          <w:b/>
+          <w:sz w:val="20"/>
+        </w:rPr>
+        <w:t xml:space="preserve">1.  </w:t>
+      </w:r>
+      <w:r>
+        <w:rPr>
+          <w:sz w:val="20"/>
+        </w:rPr>
+        <w:t>Menü Verkauf -&gt; Aufträge öffnen und den Auftrag S00074 öffnen.</w:t>
+      </w:r>
+    </w:p>
+    <w:p>
+      <w:pPr>
+        <w:spacing w:after="40" w:line="264" w:lineRule="auto"/>
+        <w:ind w:left="397" w:hanging="397"/>
+      </w:pPr>
+      <w:r>
+        <w:rPr>
+          <w:b/>
+          <w:sz w:val="20"/>
+        </w:rPr>
+        <w:t xml:space="preserve">2.  </w:t>
+      </w:r>
+      <w:r>
+        <w:rPr>
+          <w:sz w:val="20"/>
+        </w:rPr>
+        <w:t>In den Reiter „Weitere Informationen“ wechseln.</w:t>
+      </w:r>
+    </w:p>
+    <w:p>
+      <w:pPr>
+        <w:spacing w:after="40" w:line="264" w:lineRule="auto"/>
+        <w:ind w:left="397" w:hanging="397"/>
+      </w:pPr>
+      <w:r>
+        <w:rPr>
+          <w:b/>
+          <w:sz w:val="20"/>
+        </w:rPr>
+        <w:t xml:space="preserve">3.  </w:t>
+      </w:r>
+      <w:r>
+        <w:rPr>
+          <w:sz w:val="20"/>
+        </w:rPr>
+        <w:t>Im Block VERKAUF das Feld „Kundenreferenz“ ausfüllen.</w:t>
+      </w:r>
+    </w:p>
+    <w:p>
+      <w:pPr>
+        <w:spacing w:after="40" w:line="264" w:lineRule="auto"/>
+        <w:ind w:left="397" w:hanging="397"/>
+      </w:pPr>
+      <w:r>
+        <w:rPr>
+          <w:b/>
+          <w:sz w:val="20"/>
+        </w:rPr>
+        <w:t xml:space="preserve">4.  </w:t>
+      </w:r>
+      <w:r>
+        <w:rPr>
+          <w:sz w:val="20"/>
+        </w:rPr>
+        <w:t>Auftrag speichern - Beleg und Lieferschein übernehmen die Nummer automatisch.</w:t>
       </w:r>
     </w:p>
     <w:p>
@@ -758,6 +834,41 @@
         </w:rPr>
         <w:t>Danach erscheint sie automatisch auf allen Belegen und Lieferscheinen dieses Auftrags.</w:t>
       </w:r>
+    </w:p>
+    <w:tbl>
+      <w:tblPr>
+        <w:tblStyle w:val="TableGrid"/>
+        <w:tblW w:type="auto" w:w="0"/>
+        <w:tblLook w:firstColumn="1" w:firstRow="1" w:lastColumn="0" w:lastRow="0" w:noHBand="0" w:noVBand="1" w:val="04A0"/>
+      </w:tblPr>
+      <w:tblGrid>
+        <w:gridCol w:w="9412"/>
+      </w:tblGrid>
+      <w:tr>
+        <w:tc>
+          <w:tcPr>
+            <w:tcW w:type="dxa" w:w="9412"/>
+            <w:shd w:val="clear" w:color="auto" w:fill="EEF4EF"/>
+          </w:tcPr>
+          <w:p>
+            <w:pPr>
+              <w:spacing w:after="0"/>
+            </w:pPr>
+            <w:r/>
+            <w:r>
+              <w:rPr>
+                <w:sz w:val="18"/>
+              </w:rPr>
+              <w:t>Beim Umlagerungsbeleg DS/00036 ist das Feld leer, weil der Auftrag S00074 noch keine Kundenreferenz enthält.</w:t>
+            </w:r>
+          </w:p>
+        </w:tc>
+      </w:tr>
+    </w:tbl>
+    <w:p>
+      <w:pPr>
+        <w:spacing w:after="40"/>
+      </w:pPr>
     </w:p>
     <w:p>
       <w:pPr>
@@ -864,7 +975,102 @@
           <w:color w:val="222222"/>
           <w:sz w:val="22"/>
         </w:rPr>
-        <w:t>Offen</w:t>
+        <w:t>So beheben Sie es: eigene Domain für Odoo</w:t>
+      </w:r>
+    </w:p>
+    <w:p>
+      <w:pPr>
+        <w:spacing w:after="40" w:line="264" w:lineRule="auto"/>
+        <w:ind w:left="397" w:hanging="397"/>
+      </w:pPr>
+      <w:r>
+        <w:rPr>
+          <w:b/>
+          <w:sz w:val="20"/>
+        </w:rPr>
+        <w:t xml:space="preserve">1.  </w:t>
+      </w:r>
+      <w:r>
+        <w:rPr>
+          <w:sz w:val="20"/>
+        </w:rPr>
+        <w:t>Bei STRATO anmelden, Domain erzberger-verpackungssysteme.de öffnen, DNS-Verwaltung aufrufen.</w:t>
+      </w:r>
+    </w:p>
+    <w:p>
+      <w:pPr>
+        <w:spacing w:after="40" w:line="264" w:lineRule="auto"/>
+        <w:ind w:left="397" w:hanging="397"/>
+      </w:pPr>
+      <w:r>
+        <w:rPr>
+          <w:b/>
+          <w:sz w:val="20"/>
+        </w:rPr>
+        <w:t xml:space="preserve">2.  </w:t>
+      </w:r>
+      <w:r>
+        <w:rPr>
+          <w:sz w:val="20"/>
+        </w:rPr>
+        <w:t>Neuen A-Record anlegen: Name „erp“, Typ „A“, Wert 116.203.51.135, TTL 3600.</w:t>
+      </w:r>
+    </w:p>
+    <w:p>
+      <w:pPr>
+        <w:spacing w:after="40" w:line="264" w:lineRule="auto"/>
+        <w:ind w:left="397" w:hanging="397"/>
+      </w:pPr>
+      <w:r>
+        <w:rPr>
+          <w:b/>
+          <w:sz w:val="20"/>
+        </w:rPr>
+        <w:t xml:space="preserve">3.  </w:t>
+      </w:r>
+      <w:r>
+        <w:rPr>
+          <w:sz w:val="20"/>
+        </w:rPr>
+        <w:t>Alternativ CNAME: Name „erp“, Typ „CNAME“, Wert erzberger-prod.cloudpepper.site.</w:t>
+      </w:r>
+    </w:p>
+    <w:p>
+      <w:pPr>
+        <w:spacing w:after="40" w:line="264" w:lineRule="auto"/>
+        <w:ind w:left="397" w:hanging="397"/>
+      </w:pPr>
+      <w:r>
+        <w:rPr>
+          <w:b/>
+          <w:sz w:val="20"/>
+        </w:rPr>
+        <w:t xml:space="preserve">4.  </w:t>
+      </w:r>
+      <w:r>
+        <w:rPr>
+          <w:sz w:val="20"/>
+        </w:rPr>
+        <w:t>Uns die gewünschte Adresse mitteilen (z. B. erp.erzberger-verpackungssysteme.de).</w:t>
+      </w:r>
+    </w:p>
+    <w:p>
+      <w:pPr>
+        <w:spacing w:after="40" w:line="264" w:lineRule="auto"/>
+        <w:ind w:left="397" w:hanging="397"/>
+      </w:pPr>
+      <w:r>
+        <w:rPr>
+          <w:b/>
+          <w:sz w:val="20"/>
+        </w:rPr>
+        <w:t xml:space="preserve">5.  </w:t>
+      </w:r>
+      <w:r>
+        <w:rPr>
+          <w:sz w:val="20"/>
+        </w:rPr>
+        <w:t>Wir richten die Adresse ein, holen das Zertifikat und stellen alle Links in den Mails um.</w:t>
       </w:r>
     </w:p>
     <w:p>
@@ -902,6 +1108,41 @@
         </w:rPr>
         <w:t>Die Benachrichtigungsmails enthalten zusätzlich redirect-url.email-Links; diese werden von STRATO ebenfalls beanstandet und benötigen die Freischaltung.</w:t>
       </w:r>
+    </w:p>
+    <w:tbl>
+      <w:tblPr>
+        <w:tblStyle w:val="TableGrid"/>
+        <w:tblW w:type="auto" w:w="0"/>
+        <w:tblLook w:firstColumn="1" w:firstRow="1" w:lastColumn="0" w:lastRow="0" w:noHBand="0" w:noVBand="1" w:val="04A0"/>
+      </w:tblPr>
+      <w:tblGrid>
+        <w:gridCol w:w="9412"/>
+      </w:tblGrid>
+      <w:tr>
+        <w:tc>
+          <w:tcPr>
+            <w:tcW w:type="dxa" w:w="9412"/>
+            <w:shd w:val="clear" w:color="auto" w:fill="EEF4EF"/>
+          </w:tcPr>
+          <w:p>
+            <w:pPr>
+              <w:spacing w:after="0"/>
+            </w:pPr>
+            <w:r/>
+            <w:r>
+              <w:rPr>
+                <w:sz w:val="18"/>
+              </w:rPr>
+              <w:t>Zusätzlich empfiehlt sich eine Freigabe bei STRATO für den Absender, weil die Benachrichtigungsmails zusätzlich redirect-url.email-Links enthalten.</w:t>
+            </w:r>
+          </w:p>
+        </w:tc>
+      </w:tr>
+    </w:tbl>
+    <w:p>
+      <w:pPr>
+        <w:spacing w:after="40"/>
+      </w:pPr>
     </w:p>
     <w:p>
       <w:pPr>
@@ -983,7 +1224,64 @@
           <w:color w:val="222222"/>
           <w:sz w:val="22"/>
         </w:rPr>
-        <w:t>Offen</w:t>
+        <w:t>Wenn doch ein Text auf der Rechnung erscheinen soll</w:t>
+      </w:r>
+    </w:p>
+    <w:p>
+      <w:pPr>
+        <w:spacing w:after="40" w:line="264" w:lineRule="auto"/>
+        <w:ind w:left="397" w:hanging="397"/>
+      </w:pPr>
+      <w:r>
+        <w:rPr>
+          <w:b/>
+          <w:sz w:val="20"/>
+        </w:rPr>
+        <w:t xml:space="preserve">1.  </w:t>
+      </w:r>
+      <w:r>
+        <w:rPr>
+          <w:sz w:val="20"/>
+        </w:rPr>
+        <w:t>Rechnung öffnen, Reiter „Weitere Informationen“.</w:t>
+      </w:r>
+    </w:p>
+    <w:p>
+      <w:pPr>
+        <w:spacing w:after="40" w:line="264" w:lineRule="auto"/>
+        <w:ind w:left="397" w:hanging="397"/>
+      </w:pPr>
+      <w:r>
+        <w:rPr>
+          <w:b/>
+          <w:sz w:val="20"/>
+        </w:rPr>
+        <w:t xml:space="preserve">2.  </w:t>
+      </w:r>
+      <w:r>
+        <w:rPr>
+          <w:sz w:val="20"/>
+        </w:rPr>
+        <w:t>Feld „Bedingungen und Konditionen“ ausfüllen.</w:t>
+      </w:r>
+    </w:p>
+    <w:p>
+      <w:pPr>
+        <w:spacing w:after="40" w:line="264" w:lineRule="auto"/>
+        <w:ind w:left="397" w:hanging="397"/>
+      </w:pPr>
+      <w:r>
+        <w:rPr>
+          <w:b/>
+          <w:sz w:val="20"/>
+        </w:rPr>
+        <w:t xml:space="preserve">3.  </w:t>
+      </w:r>
+      <w:r>
+        <w:rPr>
+          <w:sz w:val="20"/>
+        </w:rPr>
+        <w:t>Speichern - der Text erscheint nur auf dieser Rechnung.</w:t>
       </w:r>
     </w:p>
     <w:p>
@@ -1255,7 +1553,102 @@
           <w:color w:val="222222"/>
           <w:sz w:val="22"/>
         </w:rPr>
-        <w:t>Offen</w:t>
+        <w:t>So tragen Sie die Angaben in Odoo ein</w:t>
+      </w:r>
+    </w:p>
+    <w:p>
+      <w:pPr>
+        <w:spacing w:after="40" w:line="264" w:lineRule="auto"/>
+        <w:ind w:left="397" w:hanging="397"/>
+      </w:pPr>
+      <w:r>
+        <w:rPr>
+          <w:b/>
+          <w:sz w:val="20"/>
+        </w:rPr>
+        <w:t xml:space="preserve">1.  </w:t>
+      </w:r>
+      <w:r>
+        <w:rPr>
+          <w:sz w:val="20"/>
+        </w:rPr>
+        <w:t>Bankkonto anlegen: Einstellungen -&gt; Unternehmen -&gt; Firmen -&gt; Erzberger Verpackungssysteme -&gt; Reiter „Bankkonten“ -&gt; Zeile hinzufügen -&gt; IBAN DE37 8705 4000 3612 0096 47, Bank Erzgebirgssparkasse, BIC WELADED1STB, Kontoinhaber -&gt; speichern.</w:t>
+      </w:r>
+    </w:p>
+    <w:p>
+      <w:pPr>
+        <w:spacing w:after="40" w:line="264" w:lineRule="auto"/>
+        <w:ind w:left="397" w:hanging="397"/>
+      </w:pPr>
+      <w:r>
+        <w:rPr>
+          <w:b/>
+          <w:sz w:val="20"/>
+        </w:rPr>
+        <w:t xml:space="preserve">2.  </w:t>
+      </w:r>
+      <w:r>
+        <w:rPr>
+          <w:sz w:val="20"/>
+        </w:rPr>
+        <w:t>Gleiches für Erzberger Holzkunst mit IBAN DE87 8705 4000 0725 0807 79.</w:t>
+      </w:r>
+    </w:p>
+    <w:p>
+      <w:pPr>
+        <w:spacing w:after="40" w:line="264" w:lineRule="auto"/>
+        <w:ind w:left="397" w:hanging="397"/>
+      </w:pPr>
+      <w:r>
+        <w:rPr>
+          <w:b/>
+          <w:sz w:val="20"/>
+        </w:rPr>
+        <w:t xml:space="preserve">3.  </w:t>
+      </w:r>
+      <w:r>
+        <w:rPr>
+          <w:sz w:val="20"/>
+        </w:rPr>
+        <w:t>Bankjournal verknüpfen: Buchhaltung -&gt; Konfiguration -&gt; Buchhaltung -&gt; Journale -&gt; Journal Bank der Firma -&gt; Feld Bankkonto setzen -&gt; speichern.</w:t>
+      </w:r>
+    </w:p>
+    <w:p>
+      <w:pPr>
+        <w:spacing w:after="40" w:line="264" w:lineRule="auto"/>
+        <w:ind w:left="397" w:hanging="397"/>
+      </w:pPr>
+      <w:r>
+        <w:rPr>
+          <w:b/>
+          <w:sz w:val="20"/>
+        </w:rPr>
+        <w:t xml:space="preserve">4.  </w:t>
+      </w:r>
+      <w:r>
+        <w:rPr>
+          <w:sz w:val="20"/>
+        </w:rPr>
+        <w:t>Telefonnummer: Einstellungen -&gt; Unternehmen -&gt; Firmen -&gt; Erzberger Verpackungssysteme -&gt; Feld Telefon = +49 37754 337042 -&gt; speichern.</w:t>
+      </w:r>
+    </w:p>
+    <w:p>
+      <w:pPr>
+        <w:spacing w:after="40" w:line="264" w:lineRule="auto"/>
+        <w:ind w:left="397" w:hanging="397"/>
+      </w:pPr>
+      <w:r>
+        <w:rPr>
+          <w:b/>
+          <w:sz w:val="20"/>
+        </w:rPr>
+        <w:t xml:space="preserve">5.  </w:t>
+      </w:r>
+      <w:r>
+        <w:rPr>
+          <w:sz w:val="20"/>
+        </w:rPr>
+        <w:t>Rechnung erneut öffnen und die E-Rechnung neu erzeugen.</w:t>
       </w:r>
     </w:p>
     <w:p>
@@ -1293,6 +1686,41 @@
         </w:rPr>
         <w:t>INV/2026/00003 (Gutschein 50 €) hat Positionen ohne Steuer. Für die E-Rechnung ist mindestens eine Steuer je Position erforderlich (z. B. 0 %).</w:t>
       </w:r>
+    </w:p>
+    <w:tbl>
+      <w:tblPr>
+        <w:tblStyle w:val="TableGrid"/>
+        <w:tblW w:type="auto" w:w="0"/>
+        <w:tblLook w:firstColumn="1" w:firstRow="1" w:lastColumn="0" w:lastRow="0" w:noHBand="0" w:noVBand="1" w:val="04A0"/>
+      </w:tblPr>
+      <w:tblGrid>
+        <w:gridCol w:w="9412"/>
+      </w:tblGrid>
+      <w:tr>
+        <w:tc>
+          <w:tcPr>
+            <w:tcW w:type="dxa" w:w="9412"/>
+            <w:shd w:val="clear" w:color="auto" w:fill="EEF4EF"/>
+          </w:tcPr>
+          <w:p>
+            <w:pPr>
+              <w:spacing w:after="0"/>
+            </w:pPr>
+            <w:r/>
+            <w:r>
+              <w:rPr>
+                <w:sz w:val="18"/>
+              </w:rPr>
+              <w:t>Bitte die beiden IBAN bestätigen; sie sind den Briefköpfen entnommen. INV/2026/00003 (Gutschein 50 EUR) hat Positionen ohne Steuer - für die E-Rechnung ist mindestens eine Steuer je Position nötig (z. B. 0 %).</w:t>
+            </w:r>
+          </w:p>
+        </w:tc>
+      </w:tr>
+    </w:tbl>
+    <w:p>
+      <w:pPr>
+        <w:spacing w:after="40"/>
+      </w:pPr>
     </w:p>
     <w:p>
       <w:pPr>
@@ -1386,7 +1814,64 @@
           <w:color w:val="222222"/>
           <w:sz w:val="22"/>
         </w:rPr>
-        <w:t>Offen</w:t>
+        <w:t>Wenn eine Rechnung wieder anders aussieht</w:t>
+      </w:r>
+    </w:p>
+    <w:p>
+      <w:pPr>
+        <w:spacing w:after="40" w:line="264" w:lineRule="auto"/>
+        <w:ind w:left="397" w:hanging="397"/>
+      </w:pPr>
+      <w:r>
+        <w:rPr>
+          <w:b/>
+          <w:sz w:val="20"/>
+        </w:rPr>
+        <w:t xml:space="preserve">1.  </w:t>
+      </w:r>
+      <w:r>
+        <w:rPr>
+          <w:sz w:val="20"/>
+        </w:rPr>
+        <w:t>Buchhaltung -&gt; Konfiguration -&gt; Buchhaltung -&gt; Journale -&gt; Journal Sales der Firma öffnen.</w:t>
+      </w:r>
+    </w:p>
+    <w:p>
+      <w:pPr>
+        <w:spacing w:after="40" w:line="264" w:lineRule="auto"/>
+        <w:ind w:left="397" w:hanging="397"/>
+      </w:pPr>
+      <w:r>
+        <w:rPr>
+          <w:b/>
+          <w:sz w:val="20"/>
+        </w:rPr>
+        <w:t xml:space="preserve">2.  </w:t>
+      </w:r>
+      <w:r>
+        <w:rPr>
+          <w:sz w:val="20"/>
+        </w:rPr>
+        <w:t>Feld PDF-Vorlage prüfen: Erzberger Rechnungsvorlage muss gewählt sein.</w:t>
+      </w:r>
+    </w:p>
+    <w:p>
+      <w:pPr>
+        <w:spacing w:after="40" w:line="264" w:lineRule="auto"/>
+        <w:ind w:left="397" w:hanging="397"/>
+      </w:pPr>
+      <w:r>
+        <w:rPr>
+          <w:b/>
+          <w:sz w:val="20"/>
+        </w:rPr>
+        <w:t xml:space="preserve">3.  </w:t>
+      </w:r>
+      <w:r>
+        <w:rPr>
+          <w:sz w:val="20"/>
+        </w:rPr>
+        <w:t>Speichern und die Rechnung neu drucken.</w:t>
       </w:r>
     </w:p>
     <w:p>
@@ -1481,7 +1966,102 @@
           <w:color w:val="222222"/>
           <w:sz w:val="22"/>
         </w:rPr>
-        <w:t>Offen</w:t>
+        <w:t>Was wir von Ihnen benötigen</w:t>
+      </w:r>
+    </w:p>
+    <w:p>
+      <w:pPr>
+        <w:spacing w:after="40" w:line="264" w:lineRule="auto"/>
+        <w:ind w:left="397" w:hanging="397"/>
+      </w:pPr>
+      <w:r>
+        <w:rPr>
+          <w:b/>
+          <w:sz w:val="20"/>
+        </w:rPr>
+        <w:t xml:space="preserve">1.  </w:t>
+      </w:r>
+      <w:r>
+        <w:rPr>
+          <w:sz w:val="20"/>
+        </w:rPr>
+        <w:t>Entscheidung für einen Anbieter: Cloud-TSE (fiskaly) oder Middleware (fiskaltrust).</w:t>
+      </w:r>
+    </w:p>
+    <w:p>
+      <w:pPr>
+        <w:spacing w:after="40" w:line="264" w:lineRule="auto"/>
+        <w:ind w:left="397" w:hanging="397"/>
+      </w:pPr>
+      <w:r>
+        <w:rPr>
+          <w:b/>
+          <w:sz w:val="20"/>
+        </w:rPr>
+        <w:t xml:space="preserve">2.  </w:t>
+      </w:r>
+      <w:r>
+        <w:rPr>
+          <w:sz w:val="20"/>
+        </w:rPr>
+        <w:t>Zugangsdaten des Anbieters, falls vorhanden.</w:t>
+      </w:r>
+    </w:p>
+    <w:p>
+      <w:pPr>
+        <w:spacing w:after="40" w:line="264" w:lineRule="auto"/>
+        <w:ind w:left="397" w:hanging="397"/>
+      </w:pPr>
+      <w:r>
+        <w:rPr>
+          <w:b/>
+          <w:sz w:val="20"/>
+        </w:rPr>
+        <w:t xml:space="preserve">3.  </w:t>
+      </w:r>
+      <w:r>
+        <w:rPr>
+          <w:sz w:val="20"/>
+        </w:rPr>
+        <w:t>TeamViewer-ID und Kennwort des Kassen-PCs.</w:t>
+      </w:r>
+    </w:p>
+    <w:p>
+      <w:pPr>
+        <w:spacing w:after="40" w:line="264" w:lineRule="auto"/>
+        <w:ind w:left="397" w:hanging="397"/>
+      </w:pPr>
+      <w:r>
+        <w:rPr>
+          <w:b/>
+          <w:sz w:val="20"/>
+        </w:rPr>
+        <w:t xml:space="preserve">4.  </w:t>
+      </w:r>
+      <w:r>
+        <w:rPr>
+          <w:sz w:val="20"/>
+        </w:rPr>
+        <w:t>Wunschtermin für die Einrichtung inklusive Uhrzeit.</w:t>
+      </w:r>
+    </w:p>
+    <w:p>
+      <w:pPr>
+        <w:spacing w:after="40" w:line="264" w:lineRule="auto"/>
+        <w:ind w:left="397" w:hanging="397"/>
+      </w:pPr>
+      <w:r>
+        <w:rPr>
+          <w:b/>
+          <w:sz w:val="20"/>
+        </w:rPr>
+        <w:t xml:space="preserve">5.  </w:t>
+      </w:r>
+      <w:r>
+        <w:rPr>
+          <w:sz w:val="20"/>
+        </w:rPr>
+        <w:t>Angabe, welcher Bondrucker mit TSE-Stick im Einsatz ist.</w:t>
       </w:r>
     </w:p>
     <w:p>
@@ -1519,6 +2099,420 @@
         </w:rPr>
         <w:t>Einrichtung vor Ort: TSE-Stick im Bondrucker, Kassenanbindung, Testbeleg.</w:t>
       </w:r>
+    </w:p>
+    <w:p>
+      <w:pPr>
+        <w:keepNext/>
+        <w:spacing w:before="320" w:after="120"/>
+        <w:pBdr>
+          <w:bottom w:val="single" w:sz="6" w:space="3" w:color="1E5E3A"/>
+        </w:pBdr>
+      </w:pPr>
+      <w:r>
+        <w:rPr>
+          <w:b/>
+          <w:color w:val="1E5E3A"/>
+          <w:sz w:val="28"/>
+        </w:rPr>
+        <w:t>Was wir von Ihnen benötigen</w:t>
+      </w:r>
+    </w:p>
+    <w:tbl>
+      <w:tblPr>
+        <w:tblStyle w:val="TableGrid"/>
+        <w:tblW w:type="auto" w:w="0"/>
+        <w:tblLook w:firstColumn="1" w:firstRow="1" w:lastColumn="0" w:lastRow="0" w:noHBand="0" w:noVBand="1" w:val="04A0"/>
+      </w:tblPr>
+      <w:tblGrid>
+        <w:gridCol w:w="3137"/>
+        <w:gridCol w:w="3137"/>
+        <w:gridCol w:w="3137"/>
+      </w:tblGrid>
+      <w:tr>
+        <w:tc>
+          <w:tcPr>
+            <w:tcW w:type="dxa" w:w="794"/>
+            <w:shd w:val="clear" w:color="auto" w:fill="1E5E3A"/>
+          </w:tcPr>
+          <w:p>
+            <w:pPr>
+              <w:spacing w:after="0"/>
+            </w:pPr>
+            <w:r/>
+            <w:r>
+              <w:rPr>
+                <w:b/>
+                <w:color w:val="FFFFFF"/>
+                <w:sz w:val="18"/>
+              </w:rPr>
+              <w:t>Punkt</w:t>
+            </w:r>
+          </w:p>
+        </w:tc>
+        <w:tc>
+          <w:tcPr>
+            <w:tcW w:type="dxa" w:w="5783"/>
+            <w:shd w:val="clear" w:color="auto" w:fill="1E5E3A"/>
+          </w:tcPr>
+          <w:p>
+            <w:pPr>
+              <w:spacing w:after="0"/>
+            </w:pPr>
+            <w:r/>
+            <w:r>
+              <w:rPr>
+                <w:b/>
+                <w:color w:val="FFFFFF"/>
+                <w:sz w:val="18"/>
+              </w:rPr>
+              <w:t>Was wir brauchen</w:t>
+            </w:r>
+          </w:p>
+        </w:tc>
+        <w:tc>
+          <w:tcPr>
+            <w:tcW w:type="dxa" w:w="2608"/>
+            <w:shd w:val="clear" w:color="auto" w:fill="1E5E3A"/>
+          </w:tcPr>
+          <w:p>
+            <w:pPr>
+              <w:spacing w:after="0"/>
+            </w:pPr>
+            <w:r/>
+            <w:r>
+              <w:rPr>
+                <w:b/>
+                <w:color w:val="FFFFFF"/>
+                <w:sz w:val="18"/>
+              </w:rPr>
+              <w:t>Von wem</w:t>
+            </w:r>
+          </w:p>
+        </w:tc>
+      </w:tr>
+      <w:tr>
+        <w:tc>
+          <w:tcPr>
+            <w:tcW w:type="dxa" w:w="794"/>
+          </w:tcPr>
+          <w:p>
+            <w:pPr>
+              <w:spacing w:after="0" w:line="252" w:lineRule="auto"/>
+            </w:pPr>
+            <w:r/>
+            <w:r>
+              <w:rPr>
+                <w:sz w:val="18"/>
+              </w:rPr>
+              <w:t>2a</w:t>
+            </w:r>
+          </w:p>
+        </w:tc>
+        <w:tc>
+          <w:tcPr>
+            <w:tcW w:type="dxa" w:w="5783"/>
+          </w:tcPr>
+          <w:p>
+            <w:pPr>
+              <w:spacing w:after="0" w:line="252" w:lineRule="auto"/>
+            </w:pPr>
+            <w:r/>
+            <w:r>
+              <w:rPr>
+                <w:sz w:val="18"/>
+              </w:rPr>
+              <w:t>A-Record erp.erzberger-verpackungssysteme.de -&gt; 116.203.51.135</w:t>
+            </w:r>
+          </w:p>
+        </w:tc>
+        <w:tc>
+          <w:tcPr>
+            <w:tcW w:type="dxa" w:w="2608"/>
+          </w:tcPr>
+          <w:p>
+            <w:pPr>
+              <w:spacing w:after="0" w:line="252" w:lineRule="auto"/>
+            </w:pPr>
+            <w:r/>
+            <w:r>
+              <w:rPr>
+                <w:sz w:val="18"/>
+              </w:rPr>
+              <w:t>STRATO / IT</w:t>
+            </w:r>
+          </w:p>
+        </w:tc>
+      </w:tr>
+      <w:tr>
+        <w:tc>
+          <w:tcPr>
+            <w:tcW w:type="dxa" w:w="794"/>
+          </w:tcPr>
+          <w:p>
+            <w:pPr>
+              <w:spacing w:after="0" w:line="252" w:lineRule="auto"/>
+            </w:pPr>
+            <w:r/>
+            <w:r>
+              <w:rPr>
+                <w:sz w:val="18"/>
+              </w:rPr>
+              <w:t>2b</w:t>
+            </w:r>
+          </w:p>
+        </w:tc>
+        <w:tc>
+          <w:tcPr>
+            <w:tcW w:type="dxa" w:w="5783"/>
+          </w:tcPr>
+          <w:p>
+            <w:pPr>
+              <w:spacing w:after="0" w:line="252" w:lineRule="auto"/>
+            </w:pPr>
+            <w:r/>
+            <w:r>
+              <w:rPr>
+                <w:sz w:val="18"/>
+              </w:rPr>
+              <w:t>Rückmeldung zur Freigabe des Absenders bei STRATO</w:t>
+            </w:r>
+          </w:p>
+        </w:tc>
+        <w:tc>
+          <w:tcPr>
+            <w:tcW w:type="dxa" w:w="2608"/>
+          </w:tcPr>
+          <w:p>
+            <w:pPr>
+              <w:spacing w:after="0" w:line="252" w:lineRule="auto"/>
+            </w:pPr>
+            <w:r/>
+            <w:r>
+              <w:rPr>
+                <w:sz w:val="18"/>
+              </w:rPr>
+              <w:t>STRATO / IT</w:t>
+            </w:r>
+          </w:p>
+        </w:tc>
+      </w:tr>
+      <w:tr>
+        <w:tc>
+          <w:tcPr>
+            <w:tcW w:type="dxa" w:w="794"/>
+          </w:tcPr>
+          <w:p>
+            <w:pPr>
+              <w:spacing w:after="0" w:line="252" w:lineRule="auto"/>
+            </w:pPr>
+            <w:r/>
+            <w:r>
+              <w:rPr>
+                <w:sz w:val="18"/>
+              </w:rPr>
+              <w:t>4a</w:t>
+            </w:r>
+          </w:p>
+        </w:tc>
+        <w:tc>
+          <w:tcPr>
+            <w:tcW w:type="dxa" w:w="5783"/>
+          </w:tcPr>
+          <w:p>
+            <w:pPr>
+              <w:spacing w:after="0" w:line="252" w:lineRule="auto"/>
+            </w:pPr>
+            <w:r/>
+            <w:r>
+              <w:rPr>
+                <w:sz w:val="18"/>
+              </w:rPr>
+              <w:t>Bestätigung der beiden IBAN</w:t>
+            </w:r>
+          </w:p>
+        </w:tc>
+        <w:tc>
+          <w:tcPr>
+            <w:tcW w:type="dxa" w:w="2608"/>
+          </w:tcPr>
+          <w:p>
+            <w:pPr>
+              <w:spacing w:after="0" w:line="252" w:lineRule="auto"/>
+            </w:pPr>
+            <w:r/>
+            <w:r>
+              <w:rPr>
+                <w:sz w:val="18"/>
+              </w:rPr>
+              <w:t>Buchhaltung</w:t>
+            </w:r>
+          </w:p>
+        </w:tc>
+      </w:tr>
+      <w:tr>
+        <w:tc>
+          <w:tcPr>
+            <w:tcW w:type="dxa" w:w="794"/>
+          </w:tcPr>
+          <w:p>
+            <w:pPr>
+              <w:spacing w:after="0" w:line="252" w:lineRule="auto"/>
+            </w:pPr>
+            <w:r/>
+            <w:r>
+              <w:rPr>
+                <w:sz w:val="18"/>
+              </w:rPr>
+              <w:t>4b</w:t>
+            </w:r>
+          </w:p>
+        </w:tc>
+        <w:tc>
+          <w:tcPr>
+            <w:tcW w:type="dxa" w:w="5783"/>
+          </w:tcPr>
+          <w:p>
+            <w:pPr>
+              <w:spacing w:after="0" w:line="252" w:lineRule="auto"/>
+            </w:pPr>
+            <w:r/>
+            <w:r>
+              <w:rPr>
+                <w:sz w:val="18"/>
+              </w:rPr>
+              <w:t>Steuersatz für Positionen ohne Steuer (z. B. 0 %)</w:t>
+            </w:r>
+          </w:p>
+        </w:tc>
+        <w:tc>
+          <w:tcPr>
+            <w:tcW w:type="dxa" w:w="2608"/>
+          </w:tcPr>
+          <w:p>
+            <w:pPr>
+              <w:spacing w:after="0" w:line="252" w:lineRule="auto"/>
+            </w:pPr>
+            <w:r/>
+            <w:r>
+              <w:rPr>
+                <w:sz w:val="18"/>
+              </w:rPr>
+              <w:t>Buchhaltung</w:t>
+            </w:r>
+          </w:p>
+        </w:tc>
+      </w:tr>
+      <w:tr>
+        <w:tc>
+          <w:tcPr>
+            <w:tcW w:type="dxa" w:w="794"/>
+          </w:tcPr>
+          <w:p>
+            <w:pPr>
+              <w:spacing w:after="0" w:line="252" w:lineRule="auto"/>
+            </w:pPr>
+            <w:r/>
+            <w:r>
+              <w:rPr>
+                <w:sz w:val="18"/>
+              </w:rPr>
+              <w:t>6a</w:t>
+            </w:r>
+          </w:p>
+        </w:tc>
+        <w:tc>
+          <w:tcPr>
+            <w:tcW w:type="dxa" w:w="5783"/>
+          </w:tcPr>
+          <w:p>
+            <w:pPr>
+              <w:spacing w:after="0" w:line="252" w:lineRule="auto"/>
+            </w:pPr>
+            <w:r/>
+            <w:r>
+              <w:rPr>
+                <w:sz w:val="18"/>
+              </w:rPr>
+              <w:t>TeamViewer-ID und Kennwort des Kassen-PCs</w:t>
+            </w:r>
+          </w:p>
+        </w:tc>
+        <w:tc>
+          <w:tcPr>
+            <w:tcW w:type="dxa" w:w="2608"/>
+          </w:tcPr>
+          <w:p>
+            <w:pPr>
+              <w:spacing w:after="0" w:line="252" w:lineRule="auto"/>
+            </w:pPr>
+            <w:r/>
+            <w:r>
+              <w:rPr>
+                <w:sz w:val="18"/>
+              </w:rPr>
+              <w:t>Ladengeschäft</w:t>
+            </w:r>
+          </w:p>
+        </w:tc>
+      </w:tr>
+      <w:tr>
+        <w:tc>
+          <w:tcPr>
+            <w:tcW w:type="dxa" w:w="794"/>
+          </w:tcPr>
+          <w:p>
+            <w:pPr>
+              <w:spacing w:after="0" w:line="252" w:lineRule="auto"/>
+            </w:pPr>
+            <w:r/>
+            <w:r>
+              <w:rPr>
+                <w:sz w:val="18"/>
+              </w:rPr>
+              <w:t>6b</w:t>
+            </w:r>
+          </w:p>
+        </w:tc>
+        <w:tc>
+          <w:tcPr>
+            <w:tcW w:type="dxa" w:w="5783"/>
+          </w:tcPr>
+          <w:p>
+            <w:pPr>
+              <w:spacing w:after="0" w:line="252" w:lineRule="auto"/>
+            </w:pPr>
+            <w:r/>
+            <w:r>
+              <w:rPr>
+                <w:sz w:val="18"/>
+              </w:rPr>
+              <w:t>Termin für die Einrichtung</w:t>
+            </w:r>
+          </w:p>
+        </w:tc>
+        <w:tc>
+          <w:tcPr>
+            <w:tcW w:type="dxa" w:w="2608"/>
+          </w:tcPr>
+          <w:p>
+            <w:pPr>
+              <w:spacing w:after="0" w:line="252" w:lineRule="auto"/>
+            </w:pPr>
+            <w:r/>
+            <w:r>
+              <w:rPr>
+                <w:sz w:val="18"/>
+              </w:rPr>
+              <w:t>Geschäftsführung</w:t>
+            </w:r>
+          </w:p>
+        </w:tc>
+      </w:tr>
+    </w:tbl>
+    <w:p>
+      <w:pPr>
+        <w:spacing w:after="40"/>
+      </w:pPr>
     </w:p>
     <w:p>
       <w:pPr>

</xml_diff>

<commit_message>
docs: TSE ohne Anbieterempfehlung, TeamViewer zuerst
Keine Nennung von TSE-Anbietern mehr (nicht getestet). Punkt 6 fordert
TeamViewer-ID/Kennwort und Termin an; die Freigabe erfolgt erst nach der
Pruefung, vorher wird nichts umgestellt.
</commit_message>
<xml_diff>
--- a/docs/handover/Erzberger_Offene_Punkte_und_Umsetzungsstand_DE.docx
+++ b/docs/handover/Erzberger_Offene_Punkte_und_Umsetzungsstand_DE.docx
@@ -1931,6 +1931,19 @@
     </w:p>
     <w:p>
       <w:pPr>
+        <w:spacing w:after="120" w:before="0" w:line="269" w:lineRule="auto"/>
+      </w:pPr>
+      <w:r>
+        <w:rPr>
+          <w:b w:val="0"/>
+          <w:i w:val="0"/>
+          <w:sz w:val="21"/>
+        </w:rPr>
+        <w:t>Eine Aussage zur technischen Anbindung ist derzeit nicht möglich, weil sie noch nicht getestet wurde. Dafür ist zuerst ein Fernzugriff auf den Kassen-PC erforderlich.</w:t>
+      </w:r>
+    </w:p>
+    <w:p>
+      <w:pPr>
         <w:keepNext/>
         <w:spacing w:before="200" w:after="60"/>
       </w:pPr>
@@ -1966,7 +1979,7 @@
           <w:color w:val="222222"/>
           <w:sz w:val="22"/>
         </w:rPr>
-        <w:t>Was wir von Ihnen benötigen</w:t>
+        <w:t>Was wir zuerst von Ihnen benötigen</w:t>
       </w:r>
     </w:p>
     <w:p>
@@ -1985,7 +1998,7 @@
         <w:rPr>
           <w:sz w:val="20"/>
         </w:rPr>
-        <w:t>Entscheidung für einen Anbieter: Cloud-TSE (fiskaly) oder Middleware (fiskaltrust).</w:t>
+        <w:t>TeamViewer-ID und Kennwort des Kassen-PCs.</w:t>
       </w:r>
     </w:p>
     <w:p>
@@ -2004,7 +2017,7 @@
         <w:rPr>
           <w:sz w:val="20"/>
         </w:rPr>
-        <w:t>Zugangsdaten des Anbieters, falls vorhanden.</w:t>
+        <w:t>Wunschtermin für den Fernzugriff inklusive Uhrzeit.</w:t>
       </w:r>
     </w:p>
     <w:p>
@@ -2023,7 +2036,7 @@
         <w:rPr>
           <w:sz w:val="20"/>
         </w:rPr>
-        <w:t>TeamViewer-ID und Kennwort des Kassen-PCs.</w:t>
+        <w:t>Angabe, welcher Bondrucker im Einsatz ist und ob ein TSE-Stick vorliegt.</w:t>
       </w:r>
     </w:p>
     <w:p>
@@ -2042,7 +2055,7 @@
         <w:rPr>
           <w:sz w:val="20"/>
         </w:rPr>
-        <w:t>Wunschtermin für die Einrichtung inklusive Uhrzeit.</w:t>
+        <w:t>Erst nach der Prüfung über TeamViewer klären wir die technische Anbindung und melden den konkreten Bedarf zurück.</w:t>
       </w:r>
     </w:p>
     <w:p>
@@ -2061,43 +2074,7 @@
         <w:rPr>
           <w:sz w:val="20"/>
         </w:rPr>
-        <w:t>Angabe, welcher Bondrucker mit TSE-Stick im Einsatz ist.</w:t>
-      </w:r>
-    </w:p>
-    <w:p>
-      <w:pPr>
-        <w:pStyle w:val="ListBullet"/>
-        <w:spacing w:after="40" w:line="264" w:lineRule="auto"/>
-      </w:pPr>
-      <w:r>
-        <w:rPr>
-          <w:sz w:val="20"/>
-        </w:rPr>
-        <w:t>Entscheidung für einen Anbieter (Cloud-TSE über fiskaly oder Middleware über fiskaltrust).</w:t>
-      </w:r>
-    </w:p>
-    <w:p>
-      <w:pPr>
-        <w:pStyle w:val="ListBullet"/>
-        <w:spacing w:after="40" w:line="264" w:lineRule="auto"/>
-      </w:pPr>
-      <w:r>
-        <w:rPr>
-          <w:sz w:val="20"/>
-        </w:rPr>
-        <w:t>Zugangsdaten des Anbieters bereitstellen.</w:t>
-      </w:r>
-    </w:p>
-    <w:p>
-      <w:pPr>
-        <w:pStyle w:val="ListBullet"/>
-        <w:spacing w:after="40" w:line="264" w:lineRule="auto"/>
-      </w:pPr>
-      <w:r>
-        <w:rPr>
-          <w:sz w:val="20"/>
-        </w:rPr>
-        <w:t>Einrichtung vor Ort: TSE-Stick im Bondrucker, Kassenanbindung, Testbeleg.</w:t>
+        <w:t>Die Freigabe für die Einrichtung erfolgt danach - vorher wird nichts umgestellt.</w:t>
       </w:r>
     </w:p>
     <w:p>
@@ -2486,7 +2463,60 @@
               <w:rPr>
                 <w:sz w:val="18"/>
               </w:rPr>
-              <w:t>Termin für die Einrichtung</w:t>
+              <w:t>Angabe Bondrucker und TSE-Stick</w:t>
+            </w:r>
+          </w:p>
+        </w:tc>
+        <w:tc>
+          <w:tcPr>
+            <w:tcW w:type="dxa" w:w="2608"/>
+          </w:tcPr>
+          <w:p>
+            <w:pPr>
+              <w:spacing w:after="0" w:line="252" w:lineRule="auto"/>
+            </w:pPr>
+            <w:r/>
+            <w:r>
+              <w:rPr>
+                <w:sz w:val="18"/>
+              </w:rPr>
+              <w:t>Ladengeschäft</w:t>
+            </w:r>
+          </w:p>
+        </w:tc>
+      </w:tr>
+      <w:tr>
+        <w:tc>
+          <w:tcPr>
+            <w:tcW w:type="dxa" w:w="794"/>
+          </w:tcPr>
+          <w:p>
+            <w:pPr>
+              <w:spacing w:after="0" w:line="252" w:lineRule="auto"/>
+            </w:pPr>
+            <w:r/>
+            <w:r>
+              <w:rPr>
+                <w:sz w:val="18"/>
+              </w:rPr>
+              <w:t>6c</w:t>
+            </w:r>
+          </w:p>
+        </w:tc>
+        <w:tc>
+          <w:tcPr>
+            <w:tcW w:type="dxa" w:w="5783"/>
+          </w:tcPr>
+          <w:p>
+            <w:pPr>
+              <w:spacing w:after="0" w:line="252" w:lineRule="auto"/>
+            </w:pPr>
+            <w:r/>
+            <w:r>
+              <w:rPr>
+                <w:sz w:val="18"/>
+              </w:rPr>
+              <w:t>Termin für den Fernzugriff</w:t>
             </w:r>
           </w:p>
         </w:tc>

</xml_diff>